<commit_message>
feat(color-standards): update Chapter 2 Table 2.3 with RGB, HSV, and CIE Lab color metrics
</commit_message>
<xml_diff>
--- a/thanapat_research/chapters/ch03_methodology.docx
+++ b/thanapat_research/chapters/ch03_methodology.docx
@@ -12,7 +12,7 @@
       </w:r>
     </w:p>
     <w:bookmarkEnd w:id="9"/>
-    <w:bookmarkStart w:id="37" w:name="วธดำเนนการวจย"/>
+    <w:bookmarkStart w:id="58" w:name="วธดำเนนการวจย"/>
     <w:p>
       <w:pPr>
         <w:pStyle w:val="Heading1"/>
@@ -98,7 +98,7 @@
         </w:pict>
       </w:r>
     </w:p>
-    <w:bookmarkStart w:id="14" w:name="Xa9df285505c50c9eea293e3bf3dd53194531079"/>
+    <w:bookmarkStart w:id="32" w:name="Xa9df285505c50c9eea293e3bf3dd53194531079"/>
     <w:p>
       <w:pPr>
         <w:pStyle w:val="Heading2"/>
@@ -115,7 +115,7 @@
         <w:t xml:space="preserve">ชุดทดสอบค่า Soil pH ภาคสนามที่พัฒนาขึ้น ได้รับการออกแบบให้เป็นอุปกรณ์พกพาขนาดกะทัดรัด (Handheld Portable Unit) ที่มีหน่วยประมวลผลประสิทธิภาพสูงและเซนเซอร์มาตรฐานอุตสาหกรรมในตัว ประกอบด้วยองค์ประกอบฮาร์ดแวร์และการกำหนดขาเชื่อมต่อ (Pin Assignment) ดังนี้</w:t>
       </w:r>
     </w:p>
-    <w:bookmarkStart w:id="10" w:name="แผงวงจรควบคมหลก-atd3.5-s3"/>
+    <w:bookmarkStart w:id="13" w:name="แผงวงจรควบคมหลก-atd3.5-s3"/>
     <w:p>
       <w:pPr>
         <w:pStyle w:val="Heading3"/>
@@ -211,8 +211,71 @@
         <w:t xml:space="preserve">พิกเซล ควบคุมด้วยไอซีไดรเวอร์ ST7796 ผ่านอินเทอร์เฟซขนาน 8-bit หรือ SPI ความเร็วสูง และระบบสัมผัส Capacitive Touch FT6336 ผ่าน I2C Bus</w:t>
       </w:r>
     </w:p>
-    <w:bookmarkEnd w:id="10"/>
-    <w:bookmarkStart w:id="11" w:name="X691691d6c068cb375b11cc13f05546e8c6d2339"/>
+    <w:p>
+      <w:pPr>
+        <w:pStyle w:val="BodyText"/>
+      </w:pPr>
+      <w:r>
+        <w:t xml:space="preserve">ลักษณะทางกายภาพของบอร์ดควบคุมหลักและจอแสดงผลแสดงดังภาพที่ 3.1</w:t>
+      </w:r>
+    </w:p>
+    <w:p>
+      <w:pPr>
+        <w:pStyle w:val="CaptionedFigure"/>
+      </w:pPr>
+      <w:r>
+        <w:drawing>
+          <wp:inline>
+            <wp:extent cx="5334000" cy="11873947"/>
+            <wp:effectExtent b="0" l="0" r="0" t="0"/>
+            <wp:docPr descr="ภาพที่ 3.1 บอร์ดควบคุมหลัก ATD3.5-S3 ขับเคลื่อนด้วยไมโครคอนโทรลเลอร์ ESP32-S3 พร้อมจอแสดงผลสีสัมผัส IPS ขนาด 3.5 นิ้ว" title="" id="11" name="Picture"/>
+            <a:graphic>
+              <a:graphicData uri="http://schemas.openxmlformats.org/drawingml/2006/picture">
+                <pic:pic>
+                  <pic:nvPicPr>
+                    <pic:cNvPr descr="figures/fig3_1_atd35_s3_main_board.jpg" id="12" name="Picture"/>
+                    <pic:cNvPicPr>
+                      <a:picLocks noChangeArrowheads="1" noChangeAspect="1"/>
+                    </pic:cNvPicPr>
+                  </pic:nvPicPr>
+                  <pic:blipFill>
+                    <a:blip r:embed="rId10"/>
+                    <a:stretch>
+                      <a:fillRect/>
+                    </a:stretch>
+                  </pic:blipFill>
+                  <pic:spPr bwMode="auto">
+                    <a:xfrm>
+                      <a:off x="0" y="0"/>
+                      <a:ext cx="5334000" cy="11873947"/>
+                    </a:xfrm>
+                    <a:prstGeom prst="rect">
+                      <a:avLst/>
+                    </a:prstGeom>
+                    <a:noFill/>
+                    <a:ln w="9525">
+                      <a:noFill/>
+                      <a:headEnd/>
+                      <a:tailEnd/>
+                    </a:ln>
+                  </pic:spPr>
+                </pic:pic>
+              </a:graphicData>
+            </a:graphic>
+          </wp:inline>
+        </w:drawing>
+      </w:r>
+    </w:p>
+    <w:p>
+      <w:pPr>
+        <w:pStyle w:val="ImageCaption"/>
+      </w:pPr>
+      <w:r>
+        <w:t xml:space="preserve">ภาพที่ 3.1 บอร์ดควบคุมหลัก ATD3.5-S3 ขับเคลื่อนด้วยไมโครคอนโทรลเลอร์ ESP32-S3 พร้อมจอแสดงผลสีสัมผัส IPS ขนาด 3.5 นิ้ว</w:t>
+      </w:r>
+    </w:p>
+    <w:bookmarkEnd w:id="13"/>
+    <w:bookmarkStart w:id="20" w:name="X691691d6c068cb375b11cc13f05546e8c6d2339"/>
     <w:p>
       <w:pPr>
         <w:pStyle w:val="Heading3"/>
@@ -774,8 +837,126 @@
         </w:tc>
       </w:tr>
     </w:tbl>
-    <w:bookmarkEnd w:id="11"/>
-    <w:bookmarkStart w:id="12" w:name="โพรบวดดนอตสาหกรรม-7-in-1-modbus-rs485"/>
+    <w:p>
+      <w:pPr>
+        <w:pStyle w:val="BodyText"/>
+      </w:pPr>
+      <w:r>
+        <w:t xml:space="preserve">แผงวงจรขยาย Farm1 Shield แสดงดังภาพที่ 3.2 และลักษณะการเข้าสายสัญญาณบนเทอร์มินัลบล็อกแสดงดังภาพที่ 3.3</w:t>
+      </w:r>
+    </w:p>
+    <w:p>
+      <w:pPr>
+        <w:pStyle w:val="CaptionedFigure"/>
+      </w:pPr>
+      <w:r>
+        <w:drawing>
+          <wp:inline>
+            <wp:extent cx="5334000" cy="11873947"/>
+            <wp:effectExtent b="0" l="0" r="0" t="0"/>
+            <wp:docPr descr="ภาพที่ 3.2 แผงวงจรขยาย Farm1 Shield สำหรับเชื่อมต่อสัญญาณอุตสาหกรรม RS485 และเซนเซอร์สิ่งแวดล้อม" title="" id="15" name="Picture"/>
+            <a:graphic>
+              <a:graphicData uri="http://schemas.openxmlformats.org/drawingml/2006/picture">
+                <pic:pic>
+                  <pic:nvPicPr>
+                    <pic:cNvPr descr="figures/fig3_2_farm1_shield.jpg" id="16" name="Picture"/>
+                    <pic:cNvPicPr>
+                      <a:picLocks noChangeArrowheads="1" noChangeAspect="1"/>
+                    </pic:cNvPicPr>
+                  </pic:nvPicPr>
+                  <pic:blipFill>
+                    <a:blip r:embed="rId14"/>
+                    <a:stretch>
+                      <a:fillRect/>
+                    </a:stretch>
+                  </pic:blipFill>
+                  <pic:spPr bwMode="auto">
+                    <a:xfrm>
+                      <a:off x="0" y="0"/>
+                      <a:ext cx="5334000" cy="11873947"/>
+                    </a:xfrm>
+                    <a:prstGeom prst="rect">
+                      <a:avLst/>
+                    </a:prstGeom>
+                    <a:noFill/>
+                    <a:ln w="9525">
+                      <a:noFill/>
+                      <a:headEnd/>
+                      <a:tailEnd/>
+                    </a:ln>
+                  </pic:spPr>
+                </pic:pic>
+              </a:graphicData>
+            </a:graphic>
+          </wp:inline>
+        </w:drawing>
+      </w:r>
+    </w:p>
+    <w:p>
+      <w:pPr>
+        <w:pStyle w:val="ImageCaption"/>
+      </w:pPr>
+      <w:r>
+        <w:t xml:space="preserve">ภาพที่ 3.2 แผงวงจรขยาย Farm1 Shield สำหรับเชื่อมต่อสัญญาณอุตสาหกรรม RS485 และเซนเซอร์สิ่งแวดล้อม</w:t>
+      </w:r>
+    </w:p>
+    <w:p>
+      <w:pPr>
+        <w:pStyle w:val="CaptionedFigure"/>
+      </w:pPr>
+      <w:r>
+        <w:drawing>
+          <wp:inline>
+            <wp:extent cx="5334000" cy="11873947"/>
+            <wp:effectExtent b="0" l="0" r="0" t="0"/>
+            <wp:docPr descr="ภาพที่ 3.3 ลักษณะการเข้าสายสัญญาณเซนเซอร์บนเทอร์มินัลบล็อกของบอร์ด Farm1 Shield" title="" id="18" name="Picture"/>
+            <a:graphic>
+              <a:graphicData uri="http://schemas.openxmlformats.org/drawingml/2006/picture">
+                <pic:pic>
+                  <pic:nvPicPr>
+                    <pic:cNvPr descr="figures/fig3_3_terminal_wiring.jpg" id="19" name="Picture"/>
+                    <pic:cNvPicPr>
+                      <a:picLocks noChangeArrowheads="1" noChangeAspect="1"/>
+                    </pic:cNvPicPr>
+                  </pic:nvPicPr>
+                  <pic:blipFill>
+                    <a:blip r:embed="rId17"/>
+                    <a:stretch>
+                      <a:fillRect/>
+                    </a:stretch>
+                  </pic:blipFill>
+                  <pic:spPr bwMode="auto">
+                    <a:xfrm>
+                      <a:off x="0" y="0"/>
+                      <a:ext cx="5334000" cy="11873947"/>
+                    </a:xfrm>
+                    <a:prstGeom prst="rect">
+                      <a:avLst/>
+                    </a:prstGeom>
+                    <a:noFill/>
+                    <a:ln w="9525">
+                      <a:noFill/>
+                      <a:headEnd/>
+                      <a:tailEnd/>
+                    </a:ln>
+                  </pic:spPr>
+                </pic:pic>
+              </a:graphicData>
+            </a:graphic>
+          </wp:inline>
+        </w:drawing>
+      </w:r>
+    </w:p>
+    <w:p>
+      <w:pPr>
+        <w:pStyle w:val="ImageCaption"/>
+      </w:pPr>
+      <w:r>
+        <w:t xml:space="preserve">ภาพที่ 3.3 ลักษณะการเข้าสายสัญญาณเซนเซอร์บนเทอร์มินัลบล็อกของบอร์ด Farm1 Shield</w:t>
+      </w:r>
+    </w:p>
+    <w:bookmarkEnd w:id="20"/>
+    <w:bookmarkStart w:id="27" w:name="โพรบวดดนอตสาหกรรม-7-in-1-modbus-rs485"/>
     <w:p>
       <w:pPr>
         <w:pStyle w:val="Heading3"/>
@@ -789,11 +970,121 @@
         <w:pStyle w:val="FirstParagraph"/>
       </w:pPr>
       <w:r>
-        <w:t xml:space="preserve">ใช้โพรบตรวจวัดดินอุตสาหกรรมชนิดเข็มแท่งโลหะสแตนเลสสตีล 316L ทนต่อการกัดกร่อนของสารเคมีและกรดในดิน อ่านค่าพารามิเตอร์เคมีและฟิสิกส์ 7 ค่าพร้อมกัน ได้แก่ ค่าความเป็นกรด-ด่าง (Soil pH), อุณหภูมิดิน (Soil Temperature), ความชื้นในดิน (Soil Moisture), สภาพนำไฟฟ้า (EC), ไนโตรเจน (N), ฟอสฟอรัส (P), และโพแทสเซียม (K)</w:t>
-      </w:r>
-    </w:p>
-    <w:bookmarkEnd w:id="12"/>
-    <w:bookmarkStart w:id="13" w:name="เซนเซอรอณหภมอางอง-sensirion-sht45"/>
+        <w:t xml:space="preserve">ใช้โพรบตรวจวัดดินอุตสาหกรรมชนิดเข็มแท่งโลหะสแตนเลสสตีล 316L ทนต่อการกัดกร่อนของสารเคมีและกรดในดิน อ่านค่าพารามิเตอร์เคมีและฟิสิกส์ 7 ค่าพร้อมกัน ได้แก่ ค่าความเป็นกรด-ด่าง (Soil pH), อุณหภูมิดิน (Soil Temperature), ความชื้นในดิน (Soil Moisture), สภาพนำไฟฟ้า (EC), ไนโตรเจน (N), ฟอสฟอรัส (P), และโพแทสเซียม (K) ลักษณะของโพรบวัดดินอุตสาหกรรมแสดงดังภาพที่ 3.4 และโครงสร้างเข็มวัดสแตนเลสสตีล 316L ทางการแพทย์แสดงดังภาพที่ 3.5</w:t>
+      </w:r>
+    </w:p>
+    <w:p>
+      <w:pPr>
+        <w:pStyle w:val="CaptionedFigure"/>
+      </w:pPr>
+      <w:r>
+        <w:drawing>
+          <wp:inline>
+            <wp:extent cx="5334000" cy="11873947"/>
+            <wp:effectExtent b="0" l="0" r="0" t="0"/>
+            <wp:docPr descr="ภาพที่ 3.4 โพรบตรวจวัดคุณสมบัติดินอุตสาหกรรม 7-in-1 Modbus RS485 ชนิดแท่งสแตนเลสสตีล 316L ทนต่อสารเคมี" title="" id="22" name="Picture"/>
+            <a:graphic>
+              <a:graphicData uri="http://schemas.openxmlformats.org/drawingml/2006/picture">
+                <pic:pic>
+                  <pic:nvPicPr>
+                    <pic:cNvPr descr="figures/fig3_4_modbus_soil_probe_actual.jpg" id="23" name="Picture"/>
+                    <pic:cNvPicPr>
+                      <a:picLocks noChangeArrowheads="1" noChangeAspect="1"/>
+                    </pic:cNvPicPr>
+                  </pic:nvPicPr>
+                  <pic:blipFill>
+                    <a:blip r:embed="rId21"/>
+                    <a:stretch>
+                      <a:fillRect/>
+                    </a:stretch>
+                  </pic:blipFill>
+                  <pic:spPr bwMode="auto">
+                    <a:xfrm>
+                      <a:off x="0" y="0"/>
+                      <a:ext cx="5334000" cy="11873947"/>
+                    </a:xfrm>
+                    <a:prstGeom prst="rect">
+                      <a:avLst/>
+                    </a:prstGeom>
+                    <a:noFill/>
+                    <a:ln w="9525">
+                      <a:noFill/>
+                      <a:headEnd/>
+                      <a:tailEnd/>
+                    </a:ln>
+                  </pic:spPr>
+                </pic:pic>
+              </a:graphicData>
+            </a:graphic>
+          </wp:inline>
+        </w:drawing>
+      </w:r>
+    </w:p>
+    <w:p>
+      <w:pPr>
+        <w:pStyle w:val="ImageCaption"/>
+      </w:pPr>
+      <w:r>
+        <w:t xml:space="preserve">ภาพที่ 3.4 โพรบตรวจวัดคุณสมบัติดินอุตสาหกรรม 7-in-1 Modbus RS485 ชนิดแท่งสแตนเลสสตีล 316L ทนต่อสารเคมี</w:t>
+      </w:r>
+    </w:p>
+    <w:p>
+      <w:pPr>
+        <w:pStyle w:val="CaptionedFigure"/>
+      </w:pPr>
+      <w:r>
+        <w:drawing>
+          <wp:inline>
+            <wp:extent cx="3657600" cy="2731008"/>
+            <wp:effectExtent b="0" l="0" r="0" t="0"/>
+            <wp:docPr descr="ภาพที่ 3.5 โครงสร้างเข็มวัดสแตนเลสสตีล 316L ทางการแพทย์ของโพรบวัดดิน 7-in-1 และข้อต่อเคเบิลกันน้ำมาตรฐานอุตสาหกรรม" title="" id="25" name="Picture"/>
+            <a:graphic>
+              <a:graphicData uri="http://schemas.openxmlformats.org/drawingml/2006/picture">
+                <pic:pic>
+                  <pic:nvPicPr>
+                    <pic:cNvPr descr="figures/fig3_5_soil_probe_electrodes_macro.jpg" id="26" name="Picture"/>
+                    <pic:cNvPicPr>
+                      <a:picLocks noChangeArrowheads="1" noChangeAspect="1"/>
+                    </pic:cNvPicPr>
+                  </pic:nvPicPr>
+                  <pic:blipFill>
+                    <a:blip r:embed="rId24"/>
+                    <a:stretch>
+                      <a:fillRect/>
+                    </a:stretch>
+                  </pic:blipFill>
+                  <pic:spPr bwMode="auto">
+                    <a:xfrm>
+                      <a:off x="0" y="0"/>
+                      <a:ext cx="3657600" cy="2731008"/>
+                    </a:xfrm>
+                    <a:prstGeom prst="rect">
+                      <a:avLst/>
+                    </a:prstGeom>
+                    <a:noFill/>
+                    <a:ln w="9525">
+                      <a:noFill/>
+                      <a:headEnd/>
+                      <a:tailEnd/>
+                    </a:ln>
+                  </pic:spPr>
+                </pic:pic>
+              </a:graphicData>
+            </a:graphic>
+          </wp:inline>
+        </w:drawing>
+      </w:r>
+    </w:p>
+    <w:p>
+      <w:pPr>
+        <w:pStyle w:val="ImageCaption"/>
+      </w:pPr>
+      <w:r>
+        <w:t xml:space="preserve">ภาพที่ 3.5 โครงสร้างเข็มวัดสแตนเลสสตีล 316L ทางการแพทย์ของโพรบวัดดิน 7-in-1 และข้อต่อเคเบิลกันน้ำมาตรฐานอุตสาหกรรม</w:t>
+      </w:r>
+    </w:p>
+    <w:bookmarkEnd w:id="27"/>
+    <w:bookmarkStart w:id="31" w:name="เซนเซอรอณหภมอางอง-sensirion-sht45"/>
     <w:p>
       <w:pPr>
         <w:pStyle w:val="Heading3"/>
@@ -845,6 +1136,67 @@
           <m:t>C</m:t>
         </m:r>
       </m:oMath>
+      <w:r>
+        <w:t xml:space="preserve"> </w:t>
+      </w:r>
+      <w:r>
+        <w:t xml:space="preserve">โดยติดตั้งอยู่ภายในปลอกกรองโลหะซินเตอร์สแตนเลสเพื่อป้องกันละอองน้ำและฝุ่นละออง ดังแสดงในภาพที่ 3.6</w:t>
+      </w:r>
+    </w:p>
+    <w:p>
+      <w:pPr>
+        <w:pStyle w:val="CaptionedFigure"/>
+      </w:pPr>
+      <w:r>
+        <w:drawing>
+          <wp:inline>
+            <wp:extent cx="5334000" cy="2396132"/>
+            <wp:effectExtent b="0" l="0" r="0" t="0"/>
+            <wp:docPr descr="ภาพที่ 3.6 เซนเซอร์อุณหภูมิและความชื้นอ้างอิง Sensirion SHT45 ในปลอกกรองโลหะซินเตอร์สแตนเลสพร้อมสายสัญญาณ" title="" id="29" name="Picture"/>
+            <a:graphic>
+              <a:graphicData uri="http://schemas.openxmlformats.org/drawingml/2006/picture">
+                <pic:pic>
+                  <pic:nvPicPr>
+                    <pic:cNvPr descr="figures/fig3_6_sht45_precision_sensor.jpg" id="30" name="Picture"/>
+                    <pic:cNvPicPr>
+                      <a:picLocks noChangeArrowheads="1" noChangeAspect="1"/>
+                    </pic:cNvPicPr>
+                  </pic:nvPicPr>
+                  <pic:blipFill>
+                    <a:blip r:embed="rId28"/>
+                    <a:stretch>
+                      <a:fillRect/>
+                    </a:stretch>
+                  </pic:blipFill>
+                  <pic:spPr bwMode="auto">
+                    <a:xfrm>
+                      <a:off x="0" y="0"/>
+                      <a:ext cx="5334000" cy="2396132"/>
+                    </a:xfrm>
+                    <a:prstGeom prst="rect">
+                      <a:avLst/>
+                    </a:prstGeom>
+                    <a:noFill/>
+                    <a:ln w="9525">
+                      <a:noFill/>
+                      <a:headEnd/>
+                      <a:tailEnd/>
+                    </a:ln>
+                  </pic:spPr>
+                </pic:pic>
+              </a:graphicData>
+            </a:graphic>
+          </wp:inline>
+        </w:drawing>
+      </w:r>
+    </w:p>
+    <w:p>
+      <w:pPr>
+        <w:pStyle w:val="ImageCaption"/>
+      </w:pPr>
+      <w:r>
+        <w:t xml:space="preserve">ภาพที่ 3.6 เซนเซอร์อุณหภูมิและความชื้นอ้างอิง Sensirion SHT45 ในปลอกกรองโลหะซินเตอร์สแตนเลสพร้อมสายสัญญาณ</w:t>
+      </w:r>
     </w:p>
     <w:p>
       <w:r>
@@ -853,9 +1205,9 @@
         </w:pict>
       </w:r>
     </w:p>
-    <w:bookmarkEnd w:id="13"/>
-    <w:bookmarkEnd w:id="14"/>
-    <w:bookmarkStart w:id="18" w:name="Xd8d39363a4dd73332fd0a998a8ba14ed2828ff2"/>
+    <w:bookmarkEnd w:id="31"/>
+    <w:bookmarkEnd w:id="32"/>
+    <w:bookmarkStart w:id="36" w:name="Xd8d39363a4dd73332fd0a998a8ba14ed2828ff2"/>
     <w:p>
       <w:pPr>
         <w:pStyle w:val="Heading2"/>
@@ -864,7 +1216,7 @@
         <w:t xml:space="preserve">3.2 การเตรียมสารละลายบัฟเฟอร์มาตรฐานและอุปกรณ์ควบคุมสภาวะแวดล้อม</w:t>
       </w:r>
     </w:p>
-    <w:bookmarkStart w:id="15" w:name="การเตรยมสารละลายบฟเฟอรมาตรฐานอางอง"/>
+    <w:bookmarkStart w:id="33" w:name="การเตรยมสารละลายบฟเฟอรมาตรฐานอางอง"/>
     <w:p>
       <w:pPr>
         <w:pStyle w:val="Heading3"/>
@@ -1030,8 +1382,8 @@
         <w:t xml:space="preserve">ก่อนนำมาใช้งาน</w:t>
       </w:r>
     </w:p>
-    <w:bookmarkEnd w:id="15"/>
-    <w:bookmarkStart w:id="16" w:name="อางควบคมอณหภม-precision-water-bath"/>
+    <w:bookmarkEnd w:id="33"/>
+    <w:bookmarkStart w:id="34" w:name="อางควบคมอณหภม-precision-water-bath"/>
     <w:p>
       <w:pPr>
         <w:pStyle w:val="Heading3"/>
@@ -1100,8 +1452,8 @@
         </m:r>
       </m:oMath>
     </w:p>
-    <w:bookmarkEnd w:id="16"/>
-    <w:bookmarkStart w:id="17" w:name="X1fa1ba300813ac8409216c5541ffd00bc280fd7"/>
+    <w:bookmarkEnd w:id="34"/>
+    <w:bookmarkStart w:id="35" w:name="X1fa1ba300813ac8409216c5541ffd00bc280fd7"/>
     <w:p>
       <w:pPr>
         <w:pStyle w:val="Heading3"/>
@@ -1125,9 +1477,9 @@
         </w:pict>
       </w:r>
     </w:p>
-    <w:bookmarkEnd w:id="17"/>
-    <w:bookmarkEnd w:id="18"/>
-    <w:bookmarkStart w:id="21" w:name="X07b93aa9ec861c073b80fa00a553498a5356fe4"/>
+    <w:bookmarkEnd w:id="35"/>
+    <w:bookmarkEnd w:id="36"/>
+    <w:bookmarkStart w:id="42" w:name="X07b93aa9ec861c073b80fa00a553498a5356fe4"/>
     <w:p>
       <w:pPr>
         <w:pStyle w:val="Heading2"/>
@@ -1144,7 +1496,7 @@
         <w:t xml:space="preserve">การเก็บรวบรวมข้อมูลเพื่อสร้างชุดข้อมูล (Dataset) สำหรับฝึกสอนโมเดลปัญญาประดิษฐ์ ดำเนินการผ่านระบบเก็บข้อมูลอัตโนมัติ (Automated Data Acquisition Firmware) ดังมีขั้นตอนย่อยดังนี้</w:t>
       </w:r>
     </w:p>
-    <w:bookmarkStart w:id="19" w:name="X793c1dcebcce993b30c488b2582e2aa0dbfb730"/>
+    <w:bookmarkStart w:id="37" w:name="X793c1dcebcce993b30c488b2582e2aa0dbfb730"/>
     <w:p>
       <w:pPr>
         <w:pStyle w:val="Heading3"/>
@@ -2284,8 +2636,8 @@
         <w:t xml:space="preserve">}</w:t>
       </w:r>
     </w:p>
-    <w:bookmarkEnd w:id="19"/>
-    <w:bookmarkStart w:id="20" w:name="ขนตอนการทดลองเกบขอมลในหองปฏบตการ"/>
+    <w:bookmarkEnd w:id="37"/>
+    <w:bookmarkStart w:id="41" w:name="ขนตอนการทดลองเกบขอมลในหองปฏบตการ"/>
     <w:p>
       <w:pPr>
         <w:pStyle w:val="Heading3"/>
@@ -2530,15 +2882,78 @@
       </w:r>
     </w:p>
     <w:p>
+      <w:pPr>
+        <w:pStyle w:val="FirstParagraph"/>
+      </w:pPr>
+      <w:r>
+        <w:t xml:space="preserve">ชุดการทดลองเก็บรวบรวมข้อมูลในห้องปฏิบัติการเคมีวิเคราะห์และการควบคุมอุณหภูมิแสดงดังภาพที่ 3.7</w:t>
+      </w:r>
+    </w:p>
+    <w:p>
+      <w:pPr>
+        <w:pStyle w:val="CaptionedFigure"/>
+      </w:pPr>
+      <w:r>
+        <w:drawing>
+          <wp:inline>
+            <wp:extent cx="3657600" cy="2731008"/>
+            <wp:effectExtent b="0" l="0" r="0" t="0"/>
+            <wp:docPr descr="ภาพที่ 3.7 ชุดการทดลองเก็บข้อมูลในห้องปฏิบัติการเคมีวิเคราะห์ ประกอบด้วยอ่างควบคุมอุณหภูมิความแม่นยำสูง สารละลายบัฟเฟอร์มาตรฐาน NIST และเครื่องมือวัดมาตรฐานอ้างอิง" title="" id="39" name="Picture"/>
+            <a:graphic>
+              <a:graphicData uri="http://schemas.openxmlformats.org/drawingml/2006/picture">
+                <pic:pic>
+                  <pic:nvPicPr>
+                    <pic:cNvPr descr="figures/fig3_7_lab_waterbath_calibration.jpg" id="40" name="Picture"/>
+                    <pic:cNvPicPr>
+                      <a:picLocks noChangeArrowheads="1" noChangeAspect="1"/>
+                    </pic:cNvPicPr>
+                  </pic:nvPicPr>
+                  <pic:blipFill>
+                    <a:blip r:embed="rId38"/>
+                    <a:stretch>
+                      <a:fillRect/>
+                    </a:stretch>
+                  </pic:blipFill>
+                  <pic:spPr bwMode="auto">
+                    <a:xfrm>
+                      <a:off x="0" y="0"/>
+                      <a:ext cx="3657600" cy="2731008"/>
+                    </a:xfrm>
+                    <a:prstGeom prst="rect">
+                      <a:avLst/>
+                    </a:prstGeom>
+                    <a:noFill/>
+                    <a:ln w="9525">
+                      <a:noFill/>
+                      <a:headEnd/>
+                      <a:tailEnd/>
+                    </a:ln>
+                  </pic:spPr>
+                </pic:pic>
+              </a:graphicData>
+            </a:graphic>
+          </wp:inline>
+        </w:drawing>
+      </w:r>
+    </w:p>
+    <w:p>
+      <w:pPr>
+        <w:pStyle w:val="ImageCaption"/>
+      </w:pPr>
+      <w:r>
+        <w:t xml:space="preserve">ภาพที่ 3.7 ชุดการทดลองเก็บข้อมูลในห้องปฏิบัติการเคมีวิเคราะห์ ประกอบด้วยอ่างควบคุมอุณหภูมิความแม่นยำสูง สารละลายบัฟเฟอร์มาตรฐาน NIST และเครื่องมือวัดมาตรฐานอ้างอิง</w:t>
+      </w:r>
+    </w:p>
+    <w:p>
       <w:r>
         <w:pict>
           <v:rect style="width:0;height:1.5pt" o:hralign="center" o:hrstd="t" o:hr="t"/>
         </w:pict>
       </w:r>
     </w:p>
-    <w:bookmarkEnd w:id="20"/>
-    <w:bookmarkEnd w:id="21"/>
-    <w:bookmarkStart w:id="25" w:name="Xb57aabea01a831eed09643df5bbc33610150cbb"/>
+    <w:bookmarkEnd w:id="41"/>
+    <w:bookmarkEnd w:id="42"/>
+    <w:bookmarkStart w:id="46" w:name="Xb57aabea01a831eed09643df5bbc33610150cbb"/>
     <w:p>
       <w:pPr>
         <w:pStyle w:val="Heading2"/>
@@ -2555,7 +2970,7 @@
         <w:t xml:space="preserve">ก่อนนำชุดข้อมูลเข้าสู่กระบวนการฝึกสอนโมเดลปัญญาประดิษฐ์ คณะผู้วิจัยได้ดำเนินการเตรียมข้อมูลตามขั้นตอนมาตรฐาน ดังนี้</w:t>
       </w:r>
     </w:p>
-    <w:bookmarkStart w:id="22" w:name="X9c4106c6b833556748a47d20c1e9f584a330374"/>
+    <w:bookmarkStart w:id="43" w:name="X9c4106c6b833556748a47d20c1e9f584a330374"/>
     <w:p>
       <w:pPr>
         <w:pStyle w:val="Heading3"/>
@@ -2651,8 +3066,8 @@
         </m:r>
       </m:oMath>
     </w:p>
-    <w:bookmarkEnd w:id="22"/>
-    <w:bookmarkStart w:id="23" w:name="การปรบมาตราสวนขอมล-feature-scaling"/>
+    <w:bookmarkEnd w:id="43"/>
+    <w:bookmarkStart w:id="44" w:name="การปรบมาตราสวนขอมล-feature-scaling"/>
     <w:p>
       <w:pPr>
         <w:pStyle w:val="Heading3"/>
@@ -2807,8 +3222,8 @@
         </m:oMath>
       </m:oMathPara>
     </w:p>
-    <w:bookmarkEnd w:id="23"/>
-    <w:bookmarkStart w:id="24" w:name="การแบงชดขอมล-data-splitting"/>
+    <w:bookmarkEnd w:id="44"/>
+    <w:bookmarkStart w:id="45" w:name="การแบงชดขอมล-data-splitting"/>
     <w:p>
       <w:pPr>
         <w:pStyle w:val="Heading3"/>
@@ -2898,9 +3313,9 @@
         </w:pict>
       </w:r>
     </w:p>
-    <w:bookmarkEnd w:id="24"/>
-    <w:bookmarkEnd w:id="25"/>
-    <w:bookmarkStart w:id="28" w:name="Xe533299949cfd2d0fd42c71c4cdca2a38eb946e"/>
+    <w:bookmarkEnd w:id="45"/>
+    <w:bookmarkEnd w:id="46"/>
+    <w:bookmarkStart w:id="49" w:name="Xe533299949cfd2d0fd42c71c4cdca2a38eb946e"/>
     <w:p>
       <w:pPr>
         <w:pStyle w:val="Heading2"/>
@@ -2909,7 +3324,7 @@
         <w:t xml:space="preserve">3.5 การออกแบบและพัฒนาโครงข่ายประสาทเทียม (ANN / MLP Architecture)</w:t>
       </w:r>
     </w:p>
-    <w:bookmarkStart w:id="26" w:name="โครงสรางสถาปตยกรรมโครงขายประสาทเทยม"/>
+    <w:bookmarkStart w:id="47" w:name="โครงสรางสถาปตยกรรมโครงขายประสาทเทยม"/>
     <w:p>
       <w:pPr>
         <w:pStyle w:val="Heading3"/>
@@ -3905,8 +4320,8 @@
         </m:oMath>
       </m:oMathPara>
     </w:p>
-    <w:bookmarkEnd w:id="26"/>
-    <w:bookmarkStart w:id="27" w:name="พารามเตอรการฝกสอนโมเดล-hyperparameters"/>
+    <w:bookmarkEnd w:id="47"/>
+    <w:bookmarkStart w:id="48" w:name="พารามเตอรการฝกสอนโมเดล-hyperparameters"/>
     <w:p>
       <w:pPr>
         <w:pStyle w:val="Heading3"/>
@@ -4107,9 +4522,9 @@
         </w:pict>
       </w:r>
     </w:p>
-    <w:bookmarkEnd w:id="27"/>
-    <w:bookmarkEnd w:id="28"/>
-    <w:bookmarkStart w:id="29" w:name="X4f687df53bab1983527fc82db0b5da3b483b6d0"/>
+    <w:bookmarkEnd w:id="48"/>
+    <w:bookmarkEnd w:id="49"/>
+    <w:bookmarkStart w:id="50" w:name="X4f687df53bab1983527fc82db0b5da3b483b6d0"/>
     <w:p>
       <w:pPr>
         <w:pStyle w:val="Heading2"/>
@@ -6415,8 +6830,8 @@
         </w:pict>
       </w:r>
     </w:p>
-    <w:bookmarkEnd w:id="29"/>
-    <w:bookmarkStart w:id="33" w:name="X661a91476ab9832f85769bd3eed2e2ac54b199d"/>
+    <w:bookmarkEnd w:id="50"/>
+    <w:bookmarkStart w:id="54" w:name="X661a91476ab9832f85769bd3eed2e2ac54b199d"/>
     <w:p>
       <w:pPr>
         <w:pStyle w:val="Heading2"/>
@@ -6433,7 +6848,7 @@
         <w:t xml:space="preserve">การประเมินคุณภาพและความน่าเชื่อถือของชุดทดสอบที่พัฒนาขึ้น ดำเนินการตามแนวทางมาตรฐานการตรวจสอบความใช้ได้ของวิธีเคมีวิเคราะห์ (EURACHEM / CITAC Guidelines) ดังนี้</w:t>
       </w:r>
     </w:p>
-    <w:bookmarkStart w:id="30" w:name="การทดสอบความแมน-accuracy-bias"/>
+    <w:bookmarkStart w:id="51" w:name="การทดสอบความแมน-accuracy-bias"/>
     <w:p>
       <w:pPr>
         <w:pStyle w:val="Heading3"/>
@@ -6600,8 +7015,8 @@
         <w:t xml:space="preserve">ค่าร้อยละความคลาดเคลื่อน (Bias) ต้องน้อยกว่าร้อยละ 5.0</w:t>
       </w:r>
     </w:p>
-    <w:bookmarkEnd w:id="30"/>
-    <w:bookmarkStart w:id="31" w:name="การทดสอบความเทยง-precision-rsd"/>
+    <w:bookmarkEnd w:id="51"/>
+    <w:bookmarkStart w:id="52" w:name="การทดสอบความเทยง-precision-rsd"/>
     <w:p>
       <w:pPr>
         <w:pStyle w:val="Heading3"/>
@@ -6780,8 +7195,8 @@
         <w:t xml:space="preserve">ค่า %RSD ต้องน้อยกว่าร้อยละ 5.0</w:t>
       </w:r>
     </w:p>
-    <w:bookmarkEnd w:id="31"/>
-    <w:bookmarkStart w:id="32" w:name="ตวชวดประสทธภาพของโมเดลปญญาประดษฐ"/>
+    <w:bookmarkEnd w:id="52"/>
+    <w:bookmarkStart w:id="53" w:name="ตวชวดประสทธภาพของโมเดลปญญาประดษฐ"/>
     <w:p>
       <w:pPr>
         <w:pStyle w:val="Heading3"/>
@@ -7443,9 +7858,9 @@
         </w:pict>
       </w:r>
     </w:p>
-    <w:bookmarkEnd w:id="32"/>
-    <w:bookmarkEnd w:id="33"/>
-    <w:bookmarkStart w:id="36" w:name="X1b49d1bac06deef0e9aa446153498d1ac266fcb"/>
+    <w:bookmarkEnd w:id="53"/>
+    <w:bookmarkEnd w:id="54"/>
+    <w:bookmarkStart w:id="57" w:name="X1b49d1bac06deef0e9aa446153498d1ac266fcb"/>
     <w:p>
       <w:pPr>
         <w:pStyle w:val="Heading2"/>
@@ -7454,7 +7869,7 @@
         <w:t xml:space="preserve">3.8 ระเบียบวิธีการทดสอบภาคสนามในสวนผลไม้และการวิเคราะห์ทางสถิติ</w:t>
       </w:r>
     </w:p>
-    <w:bookmarkStart w:id="34" w:name="การเกบตวอยางดนจรงในแปลงสวนทเรยน"/>
+    <w:bookmarkStart w:id="55" w:name="การเกบตวอยางดนจรงในแปลงสวนทเรยน"/>
     <w:p>
       <w:pPr>
         <w:pStyle w:val="Heading3"/>
@@ -7564,8 +7979,8 @@
         <w:t xml:space="preserve">บรรจุใส่ถุงพลาสติกปิดสนิท นำส่งห้องปฏิบัติการมาตรฐานเพื่ออบแห้ง บด ร่อน และตรวจวัดค่า pH ด้วยเครื่องวัดมาตรฐาน Mettler Toledo SevenExcellence (Method 1:1 Soil-to-Water Suspension)</w:t>
       </w:r>
     </w:p>
-    <w:bookmarkEnd w:id="34"/>
-    <w:bookmarkStart w:id="35" w:name="X4e9b541e5e16a483b208a46802fde1b07ad849b"/>
+    <w:bookmarkEnd w:id="55"/>
+    <w:bookmarkStart w:id="56" w:name="X4e9b541e5e16a483b208a46802fde1b07ad849b"/>
     <w:p>
       <w:pPr>
         <w:pStyle w:val="Heading3"/>
@@ -7662,9 +8077,9 @@
         <w:t xml:space="preserve">3. การวิเคราะห์ความสัมพันธ์เชิงเส้น (Linear Regression Analysis) และแผนภาพความสอดคล้อง Bland-Altman Plot เพื่อประเมินขอบเขตของความสอดคล้อง (Limits of Agreement: LoA)</w:t>
       </w:r>
     </w:p>
-    <w:bookmarkEnd w:id="35"/>
-    <w:bookmarkEnd w:id="36"/>
-    <w:bookmarkEnd w:id="37"/>
+    <w:bookmarkEnd w:id="56"/>
+    <w:bookmarkEnd w:id="57"/>
+    <w:bookmarkEnd w:id="58"/>
     <w:sectPr>
       <w:footnotePr>
         <w:numRestart w:val="eachSect"/>

</xml_diff>